<commit_message>
Deploy TaskFlow MVP to Vercel with Neon Postgres and verify in production
Adds api/index.py + vercel.json so the FastAPI backend runs as a Python
Serverless Function alongside the static frontend, normalizes the
postgres:// DATABASE_URL scheme for SQLAlchemy/psycopg2, and skips the
local StaticFiles mount when running on Vercel.

Provisions Neon Postgres via `vercel integration add neon` (DATABASE_URL
auto-injected) and deploys to
https://taskflow-openspec-ochre.vercel.app. Verifies the full flow
against production with Playwright (signup, team creation, kanban,
chat) and curl (owner-cannot-leave, cross-team 403), and records the
results in the docx test report. Marks tasks 7.2-7.4 and 8.6 complete
in the archived change.

Co-Authored-By: Claude Sonnet 5 <noreply@anthropic.com>
</commit_message>
<xml_diff>
--- a/docs/TaskFlow_MVP_테스트결과.docx
+++ b/docs/TaskFlow_MVP_테스트결과.docx
@@ -1501,22 +1501,316 @@
         <w:pStyle w:val="Heading1"/>
       </w:pPr>
       <w:r>
+        <w:t>6. Vercel 배포 + 프로덕션 스모크 테스트</w:t>
+      </w:r>
+    </w:p>
+    <w:tbl>
+      <w:tblPr>
+        <w:tblStyle w:val="LightGrid-Accent1"/>
+        <w:tblW w:type="auto" w:w="0"/>
+        <w:tblLook w:firstColumn="1" w:firstRow="1" w:lastColumn="0" w:lastRow="0" w:noHBand="0" w:noVBand="1" w:val="04A0"/>
+      </w:tblPr>
+      <w:tblGrid>
+        <w:gridCol w:w="2880"/>
+        <w:gridCol w:w="2880"/>
+        <w:gridCol w:w="2880"/>
+      </w:tblGrid>
+      <w:tr>
+        <w:tc>
+          <w:tcPr>
+            <w:tcW w:type="dxa" w:w="2880"/>
+          </w:tcPr>
+          <w:p>
+            <w:r>
+              <w:t>검증 항목</w:t>
+            </w:r>
+          </w:p>
+        </w:tc>
+        <w:tc>
+          <w:tcPr>
+            <w:tcW w:type="dxa" w:w="2880"/>
+          </w:tcPr>
+          <w:p>
+            <w:r>
+              <w:t>방법</w:t>
+            </w:r>
+          </w:p>
+        </w:tc>
+        <w:tc>
+          <w:tcPr>
+            <w:tcW w:type="dxa" w:w="2880"/>
+          </w:tcPr>
+          <w:p>
+            <w:r>
+              <w:t>결과</w:t>
+            </w:r>
+          </w:p>
+        </w:tc>
+      </w:tr>
+      <w:tr>
+        <w:tc>
+          <w:tcPr>
+            <w:tcW w:type="dxa" w:w="2880"/>
+          </w:tcPr>
+          <w:p>
+            <w:r>
+              <w:t>vercel integration add neon → Neon Postgres 자동 프로비저닝 + DATABASE_URL 자동 주입</w:t>
+            </w:r>
+          </w:p>
+        </w:tc>
+        <w:tc>
+          <w:tcPr>
+            <w:tcW w:type="dxa" w:w="2880"/>
+          </w:tcPr>
+          <w:p>
+            <w:r>
+              <w:t>CLI</w:t>
+            </w:r>
+          </w:p>
+        </w:tc>
+        <w:tc>
+          <w:tcPr>
+            <w:tcW w:type="dxa" w:w="2880"/>
+          </w:tcPr>
+          <w:p>
+            <w:r>
+              <w:t>PASS</w:t>
+            </w:r>
+          </w:p>
+        </w:tc>
+      </w:tr>
+      <w:tr>
+        <w:tc>
+          <w:tcPr>
+            <w:tcW w:type="dxa" w:w="2880"/>
+          </w:tcPr>
+          <w:p>
+            <w:r>
+              <w:t>vercel deploy --prod → FE(정적) + BE(Python Serverless Function) 배포</w:t>
+            </w:r>
+          </w:p>
+        </w:tc>
+        <w:tc>
+          <w:tcPr>
+            <w:tcW w:type="dxa" w:w="2880"/>
+          </w:tcPr>
+          <w:p>
+            <w:r>
+              <w:t>CLI</w:t>
+            </w:r>
+          </w:p>
+        </w:tc>
+        <w:tc>
+          <w:tcPr>
+            <w:tcW w:type="dxa" w:w="2880"/>
+          </w:tcPr>
+          <w:p>
+            <w:r>
+              <w:t>PASS</w:t>
+            </w:r>
+          </w:p>
+        </w:tc>
+      </w:tr>
+      <w:tr>
+        <w:tc>
+          <w:tcPr>
+            <w:tcW w:type="dxa" w:w="2880"/>
+          </w:tcPr>
+          <w:p>
+            <w:r>
+              <w:t>GET /health → 200 (SQLite 기본값일 땐 500이었으나 Neon 연결 후 정상화)</w:t>
+            </w:r>
+          </w:p>
+        </w:tc>
+        <w:tc>
+          <w:tcPr>
+            <w:tcW w:type="dxa" w:w="2880"/>
+          </w:tcPr>
+          <w:p>
+            <w:r>
+              <w:t>curl</w:t>
+            </w:r>
+          </w:p>
+        </w:tc>
+        <w:tc>
+          <w:tcPr>
+            <w:tcW w:type="dxa" w:w="2880"/>
+          </w:tcPr>
+          <w:p>
+            <w:r>
+              <w:t>PASS</w:t>
+            </w:r>
+          </w:p>
+        </w:tc>
+      </w:tr>
+      <w:tr>
+        <w:tc>
+          <w:tcPr>
+            <w:tcW w:type="dxa" w:w="2880"/>
+          </w:tcPr>
+          <w:p>
+            <w:r>
+              <w:t>프로덕션에서 회원가입 → 팀 생성 → 칸반 태스크 생성(한글) → 채팅 전송</w:t>
+            </w:r>
+          </w:p>
+        </w:tc>
+        <w:tc>
+          <w:tcPr>
+            <w:tcW w:type="dxa" w:w="2880"/>
+          </w:tcPr>
+          <w:p>
+            <w:r>
+              <w:t>브라우저(Playwright)</w:t>
+            </w:r>
+          </w:p>
+        </w:tc>
+        <w:tc>
+          <w:tcPr>
+            <w:tcW w:type="dxa" w:w="2880"/>
+          </w:tcPr>
+          <w:p>
+            <w:r>
+              <w:t>PASS</w:t>
+            </w:r>
+          </w:p>
+        </w:tc>
+      </w:tr>
+      <w:tr>
+        <w:tc>
+          <w:tcPr>
+            <w:tcW w:type="dxa" w:w="2880"/>
+          </w:tcPr>
+          <w:p>
+            <w:r>
+              <w:t>프로덕션에서 owner 탈퇴 시도 → 403 OWNER_CANNOT_LEAVE</w:t>
+            </w:r>
+          </w:p>
+        </w:tc>
+        <w:tc>
+          <w:tcPr>
+            <w:tcW w:type="dxa" w:w="2880"/>
+          </w:tcPr>
+          <w:p>
+            <w:r>
+              <w:t>curl</w:t>
+            </w:r>
+          </w:p>
+        </w:tc>
+        <w:tc>
+          <w:tcPr>
+            <w:tcW w:type="dxa" w:w="2880"/>
+          </w:tcPr>
+          <w:p>
+            <w:r>
+              <w:t>PASS</w:t>
+            </w:r>
+          </w:p>
+        </w:tc>
+      </w:tr>
+      <w:tr>
+        <w:tc>
+          <w:tcPr>
+            <w:tcW w:type="dxa" w:w="2880"/>
+          </w:tcPr>
+          <w:p>
+            <w:r>
+              <w:t>프로덕션에서 비멤버 접근 → 403 FORBIDDEN</w:t>
+            </w:r>
+          </w:p>
+        </w:tc>
+        <w:tc>
+          <w:tcPr>
+            <w:tcW w:type="dxa" w:w="2880"/>
+          </w:tcPr>
+          <w:p>
+            <w:r>
+              <w:t>curl</w:t>
+            </w:r>
+          </w:p>
+        </w:tc>
+        <w:tc>
+          <w:tcPr>
+            <w:tcW w:type="dxa" w:w="2880"/>
+          </w:tcPr>
+          <w:p>
+            <w:r>
+              <w:t>PASS</w:t>
+            </w:r>
+          </w:p>
+        </w:tc>
+      </w:tr>
+    </w:tbl>
+    <w:p/>
+    <w:p>
+      <w:r>
+        <w:drawing>
+          <wp:inline xmlns:a="http://schemas.openxmlformats.org/drawingml/2006/main" xmlns:pic="http://schemas.openxmlformats.org/drawingml/2006/picture">
+            <wp:extent cx="5029200" cy="3143250"/>
+            <wp:docPr id="9" name="Picture 9"/>
+            <wp:cNvGraphicFramePr>
+              <a:graphicFrameLocks noChangeAspect="1"/>
+            </wp:cNvGraphicFramePr>
+            <a:graphic>
+              <a:graphicData uri="http://schemas.openxmlformats.org/drawingml/2006/picture">
+                <pic:pic>
+                  <pic:nvPicPr>
+                    <pic:cNvPr id="0" name="09-vercel-prod-chat.png"/>
+                    <pic:cNvPicPr/>
+                  </pic:nvPicPr>
+                  <pic:blipFill>
+                    <a:blip r:embed="rId17"/>
+                    <a:stretch>
+                      <a:fillRect/>
+                    </a:stretch>
+                  </pic:blipFill>
+                  <pic:spPr>
+                    <a:xfrm>
+                      <a:off x="0" y="0"/>
+                      <a:ext cx="5029200" cy="3143250"/>
+                    </a:xfrm>
+                    <a:prstGeom prst="rect"/>
+                  </pic:spPr>
+                </pic:pic>
+              </a:graphicData>
+            </a:graphic>
+          </wp:inline>
+        </w:drawing>
+      </w:r>
+    </w:p>
+    <w:p>
+      <w:pPr>
+        <w:jc w:val="center"/>
+      </w:pPr>
+      <w:r>
+        <w:rPr>
+          <w:i/>
+          <w:sz w:val="18"/>
+        </w:rPr>
+        <w:t>배포된 Vercel URL(https://taskflow-openspec-ochre.vercel.app)에서 채팅 전송 확인</w:t>
+      </w:r>
+    </w:p>
+    <w:p/>
+    <w:p>
+      <w:pPr>
+        <w:pStyle w:val="Heading1"/>
+      </w:pPr>
+      <w:r>
         <w:t>종합</w:t>
       </w:r>
     </w:p>
     <w:p>
       <w:r>
-        <w:t>백엔드 API 18개(Auth 4 + Team 5 + Task 6 + Chat 3)와 프론트엔드 9개 화면 모두 spec-driven 스펙에 정의된 정상/에러 시나리오대로 동작함을 확인했다. 결정 #9(owner 탈퇴 차단), 결정 #10(5초 고정 폴링) 모두 코드와 화면에 그대로 반영되어 있다.</w:t>
+        <w:t>백엔드 API 18개(Auth 4 + Team 5 + Task 6 + Chat 3)와 프론트엔드 9개 화면 모두 spec-driven 스펙에 정의된 정상/에러 시나리오대로 동작함을 확인했다. 결정 #9(owner 탈퇴 차단), 결정 #10(5초 고정 폴링) 모두 코드와 화면에 그대로 반영되어 있다. Vercel(FE+BE) + Neon(Postgres) 배포까지 완료했고, 배포된 URL에서 동일한 시나리오를 브라우저 자동화와 curl로 재검증했다.</w:t>
         <w:br/>
       </w:r>
       <w:r>
         <w:rPr>
           <w:b/>
         </w:rPr>
-        <w:t xml:space="preserve">미검증 영역: </w:t>
+        <w:t xml:space="preserve">배포 URL: </w:t>
       </w:r>
       <w:r>
-        <w:t>Vercel/Neon 배포(7.2~7.4)와 배포된 URL 기준 스모크 테스트(8.6)는 실제 Vercel/Neon 계정 연동이 필요해 이번 세션에서는 진행하지 않았다.</w:t>
+        <w:t>https://taskflow-openspec-ochre.vercel.app</w:t>
       </w:r>
     </w:p>
     <w:sectPr>

</xml_diff>

<commit_message>
Add production mobile verification to the docx test report
Records the root-path 404 fix and its mobile re-verification on the
live Vercel deployment (login, kanban, hamburger drawer, chat) with
screenshots, alongside the existing test sections.

Co-Authored-By: Claude Sonnet 5 <noreply@anthropic.com>
</commit_message>
<xml_diff>
--- a/docs/TaskFlow_MVP_테스트결과.docx
+++ b/docs/TaskFlow_MVP_테스트결과.docx
@@ -1795,6 +1795,476 @@
         <w:pStyle w:val="Heading1"/>
       </w:pPr>
       <w:r>
+        <w:t>7. 루트 경로 404 수정 + 프로덕션 모바일 재확인</w:t>
+      </w:r>
+    </w:p>
+    <w:tbl>
+      <w:tblPr>
+        <w:tblStyle w:val="LightGrid-Accent1"/>
+        <w:tblW w:type="auto" w:w="0"/>
+        <w:tblLook w:firstColumn="1" w:firstRow="1" w:lastColumn="0" w:lastRow="0" w:noHBand="0" w:noVBand="1" w:val="04A0"/>
+      </w:tblPr>
+      <w:tblGrid>
+        <w:gridCol w:w="2880"/>
+        <w:gridCol w:w="2880"/>
+        <w:gridCol w:w="2880"/>
+      </w:tblGrid>
+      <w:tr>
+        <w:tc>
+          <w:tcPr>
+            <w:tcW w:type="dxa" w:w="2880"/>
+          </w:tcPr>
+          <w:p>
+            <w:r>
+              <w:t>검증 항목</w:t>
+            </w:r>
+          </w:p>
+        </w:tc>
+        <w:tc>
+          <w:tcPr>
+            <w:tcW w:type="dxa" w:w="2880"/>
+          </w:tcPr>
+          <w:p>
+            <w:r>
+              <w:t>방법</w:t>
+            </w:r>
+          </w:p>
+        </w:tc>
+        <w:tc>
+          <w:tcPr>
+            <w:tcW w:type="dxa" w:w="2880"/>
+          </w:tcPr>
+          <w:p>
+            <w:r>
+              <w:t>결과</w:t>
+            </w:r>
+          </w:p>
+        </w:tc>
+      </w:tr>
+      <w:tr>
+        <w:tc>
+          <w:tcPr>
+            <w:tcW w:type="dxa" w:w="2880"/>
+          </w:tcPr>
+          <w:p>
+            <w:r>
+              <w:t>배포 도메인 루트(/) 접근 시 404 발생 → frontend/index.html 추가로 수정</w:t>
+            </w:r>
+          </w:p>
+        </w:tc>
+        <w:tc>
+          <w:tcPr>
+            <w:tcW w:type="dxa" w:w="2880"/>
+          </w:tcPr>
+          <w:p>
+            <w:r>
+              <w:t>curl + 브라우저</w:t>
+            </w:r>
+          </w:p>
+        </w:tc>
+        <w:tc>
+          <w:tcPr>
+            <w:tcW w:type="dxa" w:w="2880"/>
+          </w:tcPr>
+          <w:p>
+            <w:r>
+              <w:t>FIXED</w:t>
+            </w:r>
+          </w:p>
+        </w:tc>
+      </w:tr>
+      <w:tr>
+        <w:tc>
+          <w:tcPr>
+            <w:tcW w:type="dxa" w:w="2880"/>
+          </w:tcPr>
+          <w:p>
+            <w:r>
+              <w:t>비로그인 상태로 루트(/) 접근 → /login.html로 리다이렉트</w:t>
+            </w:r>
+          </w:p>
+        </w:tc>
+        <w:tc>
+          <w:tcPr>
+            <w:tcW w:type="dxa" w:w="2880"/>
+          </w:tcPr>
+          <w:p>
+            <w:r>
+              <w:t>브라우저</w:t>
+            </w:r>
+          </w:p>
+        </w:tc>
+        <w:tc>
+          <w:tcPr>
+            <w:tcW w:type="dxa" w:w="2880"/>
+          </w:tcPr>
+          <w:p>
+            <w:r>
+              <w:t>PASS</w:t>
+            </w:r>
+          </w:p>
+        </w:tc>
+      </w:tr>
+      <w:tr>
+        <w:tc>
+          <w:tcPr>
+            <w:tcW w:type="dxa" w:w="2880"/>
+          </w:tcPr>
+          <w:p>
+            <w:r>
+              <w:t>로그인 상태로 루트(/) 접근 → /app.html로 리다이렉트</w:t>
+            </w:r>
+          </w:p>
+        </w:tc>
+        <w:tc>
+          <w:tcPr>
+            <w:tcW w:type="dxa" w:w="2880"/>
+          </w:tcPr>
+          <w:p>
+            <w:r>
+              <w:t>브라우저</w:t>
+            </w:r>
+          </w:p>
+        </w:tc>
+        <w:tc>
+          <w:tcPr>
+            <w:tcW w:type="dxa" w:w="2880"/>
+          </w:tcPr>
+          <w:p>
+            <w:r>
+              <w:t>PASS</w:t>
+            </w:r>
+          </w:p>
+        </w:tc>
+      </w:tr>
+      <w:tr>
+        <w:tc>
+          <w:tcPr>
+            <w:tcW w:type="dxa" w:w="2880"/>
+          </w:tcPr>
+          <w:p>
+            <w:r>
+              <w:t>프로덕션 URL, 390x844 모바일 뷰포트에서 로그인 화면 정상 렌더링</w:t>
+            </w:r>
+          </w:p>
+        </w:tc>
+        <w:tc>
+          <w:tcPr>
+            <w:tcW w:type="dxa" w:w="2880"/>
+          </w:tcPr>
+          <w:p>
+            <w:r>
+              <w:t>브라우저</w:t>
+            </w:r>
+          </w:p>
+        </w:tc>
+        <w:tc>
+          <w:tcPr>
+            <w:tcW w:type="dxa" w:w="2880"/>
+          </w:tcPr>
+          <w:p>
+            <w:r>
+              <w:t>PASS</w:t>
+            </w:r>
+          </w:p>
+        </w:tc>
+      </w:tr>
+      <w:tr>
+        <w:tc>
+          <w:tcPr>
+            <w:tcW w:type="dxa" w:w="2880"/>
+          </w:tcPr>
+          <w:p>
+            <w:r>
+              <w:t>프로덕션 URL, 모바일 칸반 화면 (햄버거 버튼, 세로 스택 컬럼)</w:t>
+            </w:r>
+          </w:p>
+        </w:tc>
+        <w:tc>
+          <w:tcPr>
+            <w:tcW w:type="dxa" w:w="2880"/>
+          </w:tcPr>
+          <w:p>
+            <w:r>
+              <w:t>브라우저</w:t>
+            </w:r>
+          </w:p>
+        </w:tc>
+        <w:tc>
+          <w:tcPr>
+            <w:tcW w:type="dxa" w:w="2880"/>
+          </w:tcPr>
+          <w:p>
+            <w:r>
+              <w:t>PASS</w:t>
+            </w:r>
+          </w:p>
+        </w:tc>
+      </w:tr>
+      <w:tr>
+        <w:tc>
+          <w:tcPr>
+            <w:tcW w:type="dxa" w:w="2880"/>
+          </w:tcPr>
+          <w:p>
+            <w:r>
+              <w:t>프로덕션 URL, 모바일 햄버거 드로어 오픈</w:t>
+            </w:r>
+          </w:p>
+        </w:tc>
+        <w:tc>
+          <w:tcPr>
+            <w:tcW w:type="dxa" w:w="2880"/>
+          </w:tcPr>
+          <w:p>
+            <w:r>
+              <w:t>브라우저</w:t>
+            </w:r>
+          </w:p>
+        </w:tc>
+        <w:tc>
+          <w:tcPr>
+            <w:tcW w:type="dxa" w:w="2880"/>
+          </w:tcPr>
+          <w:p>
+            <w:r>
+              <w:t>PASS</w:t>
+            </w:r>
+          </w:p>
+        </w:tc>
+      </w:tr>
+      <w:tr>
+        <w:tc>
+          <w:tcPr>
+            <w:tcW w:type="dxa" w:w="2880"/>
+          </w:tcPr>
+          <w:p>
+            <w:r>
+              <w:t>프로덕션 URL, 모바일 드로어에서 채팅 화면으로 이동</w:t>
+            </w:r>
+          </w:p>
+        </w:tc>
+        <w:tc>
+          <w:tcPr>
+            <w:tcW w:type="dxa" w:w="2880"/>
+          </w:tcPr>
+          <w:p>
+            <w:r>
+              <w:t>브라우저</w:t>
+            </w:r>
+          </w:p>
+        </w:tc>
+        <w:tc>
+          <w:tcPr>
+            <w:tcW w:type="dxa" w:w="2880"/>
+          </w:tcPr>
+          <w:p>
+            <w:r>
+              <w:t>PASS</w:t>
+            </w:r>
+          </w:p>
+        </w:tc>
+      </w:tr>
+    </w:tbl>
+    <w:p/>
+    <w:p>
+      <w:r>
+        <w:drawing>
+          <wp:inline xmlns:a="http://schemas.openxmlformats.org/drawingml/2006/main" xmlns:pic="http://schemas.openxmlformats.org/drawingml/2006/picture">
+            <wp:extent cx="5029200" cy="10883705"/>
+            <wp:docPr id="10" name="Picture 10"/>
+            <wp:cNvGraphicFramePr>
+              <a:graphicFrameLocks noChangeAspect="1"/>
+            </wp:cNvGraphicFramePr>
+            <a:graphic>
+              <a:graphicData uri="http://schemas.openxmlformats.org/drawingml/2006/picture">
+                <pic:pic>
+                  <pic:nvPicPr>
+                    <pic:cNvPr id="0" name="10-mobile-prod-login.png"/>
+                    <pic:cNvPicPr/>
+                  </pic:nvPicPr>
+                  <pic:blipFill>
+                    <a:blip r:embed="rId18"/>
+                    <a:stretch>
+                      <a:fillRect/>
+                    </a:stretch>
+                  </pic:blipFill>
+                  <pic:spPr>
+                    <a:xfrm>
+                      <a:off x="0" y="0"/>
+                      <a:ext cx="5029200" cy="10883705"/>
+                    </a:xfrm>
+                    <a:prstGeom prst="rect"/>
+                  </pic:spPr>
+                </pic:pic>
+              </a:graphicData>
+            </a:graphic>
+          </wp:inline>
+        </w:drawing>
+      </w:r>
+    </w:p>
+    <w:p>
+      <w:pPr>
+        <w:jc w:val="center"/>
+      </w:pPr>
+      <w:r>
+        <w:rPr>
+          <w:i/>
+          <w:sz w:val="18"/>
+        </w:rPr>
+        <w:t>프로덕션 모바일: 로그인 화면</w:t>
+      </w:r>
+    </w:p>
+    <w:p>
+      <w:r>
+        <w:drawing>
+          <wp:inline xmlns:a="http://schemas.openxmlformats.org/drawingml/2006/main" xmlns:pic="http://schemas.openxmlformats.org/drawingml/2006/picture">
+            <wp:extent cx="5029200" cy="10883705"/>
+            <wp:docPr id="11" name="Picture 11"/>
+            <wp:cNvGraphicFramePr>
+              <a:graphicFrameLocks noChangeAspect="1"/>
+            </wp:cNvGraphicFramePr>
+            <a:graphic>
+              <a:graphicData uri="http://schemas.openxmlformats.org/drawingml/2006/picture">
+                <pic:pic>
+                  <pic:nvPicPr>
+                    <pic:cNvPr id="0" name="11-mobile-prod-kanban.png"/>
+                    <pic:cNvPicPr/>
+                  </pic:nvPicPr>
+                  <pic:blipFill>
+                    <a:blip r:embed="rId19"/>
+                    <a:stretch>
+                      <a:fillRect/>
+                    </a:stretch>
+                  </pic:blipFill>
+                  <pic:spPr>
+                    <a:xfrm>
+                      <a:off x="0" y="0"/>
+                      <a:ext cx="5029200" cy="10883705"/>
+                    </a:xfrm>
+                    <a:prstGeom prst="rect"/>
+                  </pic:spPr>
+                </pic:pic>
+              </a:graphicData>
+            </a:graphic>
+          </wp:inline>
+        </w:drawing>
+      </w:r>
+    </w:p>
+    <w:p>
+      <w:pPr>
+        <w:jc w:val="center"/>
+      </w:pPr>
+      <w:r>
+        <w:rPr>
+          <w:i/>
+          <w:sz w:val="18"/>
+        </w:rPr>
+        <w:t>프로덕션 모바일: 칸반 화면</w:t>
+      </w:r>
+    </w:p>
+    <w:p>
+      <w:r>
+        <w:drawing>
+          <wp:inline xmlns:a="http://schemas.openxmlformats.org/drawingml/2006/main" xmlns:pic="http://schemas.openxmlformats.org/drawingml/2006/picture">
+            <wp:extent cx="5029200" cy="10883705"/>
+            <wp:docPr id="12" name="Picture 12"/>
+            <wp:cNvGraphicFramePr>
+              <a:graphicFrameLocks noChangeAspect="1"/>
+            </wp:cNvGraphicFramePr>
+            <a:graphic>
+              <a:graphicData uri="http://schemas.openxmlformats.org/drawingml/2006/picture">
+                <pic:pic>
+                  <pic:nvPicPr>
+                    <pic:cNvPr id="0" name="12-mobile-prod-drawer.png"/>
+                    <pic:cNvPicPr/>
+                  </pic:nvPicPr>
+                  <pic:blipFill>
+                    <a:blip r:embed="rId20"/>
+                    <a:stretch>
+                      <a:fillRect/>
+                    </a:stretch>
+                  </pic:blipFill>
+                  <pic:spPr>
+                    <a:xfrm>
+                      <a:off x="0" y="0"/>
+                      <a:ext cx="5029200" cy="10883705"/>
+                    </a:xfrm>
+                    <a:prstGeom prst="rect"/>
+                  </pic:spPr>
+                </pic:pic>
+              </a:graphicData>
+            </a:graphic>
+          </wp:inline>
+        </w:drawing>
+      </w:r>
+    </w:p>
+    <w:p>
+      <w:pPr>
+        <w:jc w:val="center"/>
+      </w:pPr>
+      <w:r>
+        <w:rPr>
+          <w:i/>
+          <w:sz w:val="18"/>
+        </w:rPr>
+        <w:t>프로덕션 모바일: 햄버거 드로어</w:t>
+      </w:r>
+    </w:p>
+    <w:p>
+      <w:r>
+        <w:drawing>
+          <wp:inline xmlns:a="http://schemas.openxmlformats.org/drawingml/2006/main" xmlns:pic="http://schemas.openxmlformats.org/drawingml/2006/picture">
+            <wp:extent cx="5029200" cy="10883705"/>
+            <wp:docPr id="13" name="Picture 13"/>
+            <wp:cNvGraphicFramePr>
+              <a:graphicFrameLocks noChangeAspect="1"/>
+            </wp:cNvGraphicFramePr>
+            <a:graphic>
+              <a:graphicData uri="http://schemas.openxmlformats.org/drawingml/2006/picture">
+                <pic:pic>
+                  <pic:nvPicPr>
+                    <pic:cNvPr id="0" name="13-mobile-prod-chat.png"/>
+                    <pic:cNvPicPr/>
+                  </pic:nvPicPr>
+                  <pic:blipFill>
+                    <a:blip r:embed="rId21"/>
+                    <a:stretch>
+                      <a:fillRect/>
+                    </a:stretch>
+                  </pic:blipFill>
+                  <pic:spPr>
+                    <a:xfrm>
+                      <a:off x="0" y="0"/>
+                      <a:ext cx="5029200" cy="10883705"/>
+                    </a:xfrm>
+                    <a:prstGeom prst="rect"/>
+                  </pic:spPr>
+                </pic:pic>
+              </a:graphicData>
+            </a:graphic>
+          </wp:inline>
+        </w:drawing>
+      </w:r>
+    </w:p>
+    <w:p>
+      <w:pPr>
+        <w:jc w:val="center"/>
+      </w:pPr>
+      <w:r>
+        <w:rPr>
+          <w:i/>
+          <w:sz w:val="18"/>
+        </w:rPr>
+        <w:t>프로덕션 모바일: 채팅 화면</w:t>
+      </w:r>
+    </w:p>
+    <w:p/>
+    <w:p>
+      <w:pPr>
+        <w:pStyle w:val="Heading1"/>
+      </w:pPr>
+      <w:r>
         <w:t>종합</w:t>
       </w:r>
     </w:p>

</xml_diff>

<commit_message>
Add local re-verification section to the docx test report
Records the full local re-test (auth, team, kanban, chat, permission
checks via curl, plus a full browser walkthrough) run after the
Vercel-related backend changes, confirming nothing regressed locally.

Co-Authored-By: Claude Sonnet 5 <noreply@anthropic.com>
</commit_message>
<xml_diff>
--- a/docs/TaskFlow_MVP_테스트결과.docx
+++ b/docs/TaskFlow_MVP_테스트결과.docx
@@ -2265,6 +2265,396 @@
         <w:pStyle w:val="Heading1"/>
       </w:pPr>
       <w:r>
+        <w:t>8. 로컬 재검증 (배포 관련 코드 변경 이후)</w:t>
+      </w:r>
+    </w:p>
+    <w:tbl>
+      <w:tblPr>
+        <w:tblStyle w:val="LightGrid-Accent1"/>
+        <w:tblW w:type="auto" w:w="0"/>
+        <w:tblLook w:firstColumn="1" w:firstRow="1" w:lastColumn="0" w:lastRow="0" w:noHBand="0" w:noVBand="1" w:val="04A0"/>
+      </w:tblPr>
+      <w:tblGrid>
+        <w:gridCol w:w="2880"/>
+        <w:gridCol w:w="2880"/>
+        <w:gridCol w:w="2880"/>
+      </w:tblGrid>
+      <w:tr>
+        <w:tc>
+          <w:tcPr>
+            <w:tcW w:type="dxa" w:w="2880"/>
+          </w:tcPr>
+          <w:p>
+            <w:r>
+              <w:t>검증 항목</w:t>
+            </w:r>
+          </w:p>
+        </w:tc>
+        <w:tc>
+          <w:tcPr>
+            <w:tcW w:type="dxa" w:w="2880"/>
+          </w:tcPr>
+          <w:p>
+            <w:r>
+              <w:t>방법</w:t>
+            </w:r>
+          </w:p>
+        </w:tc>
+        <w:tc>
+          <w:tcPr>
+            <w:tcW w:type="dxa" w:w="2880"/>
+          </w:tcPr>
+          <w:p>
+            <w:r>
+              <w:t>결과</w:t>
+            </w:r>
+          </w:p>
+        </w:tc>
+      </w:tr>
+      <w:tr>
+        <w:tc>
+          <w:tcPr>
+            <w:tcW w:type="dxa" w:w="2880"/>
+          </w:tcPr>
+          <w:p>
+            <w:r>
+              <w:t>database.py/main.py의 Vercel 대응 변경(postgres:// 정규화, VERCEL 조건부 StaticFiles) 이후 로컬 서버 재기동</w:t>
+            </w:r>
+          </w:p>
+        </w:tc>
+        <w:tc>
+          <w:tcPr>
+            <w:tcW w:type="dxa" w:w="2880"/>
+          </w:tcPr>
+          <w:p>
+            <w:r>
+              <w:t>uvicorn</w:t>
+            </w:r>
+          </w:p>
+        </w:tc>
+        <w:tc>
+          <w:tcPr>
+            <w:tcW w:type="dxa" w:w="2880"/>
+          </w:tcPr>
+          <w:p>
+            <w:r>
+              <w:t>PASS</w:t>
+            </w:r>
+          </w:p>
+        </w:tc>
+      </w:tr>
+      <w:tr>
+        <w:tc>
+          <w:tcPr>
+            <w:tcW w:type="dxa" w:w="2880"/>
+          </w:tcPr>
+          <w:p>
+            <w:r>
+              <w:t>회원가입 성공/이메일 중복(409)/약한 비밀번호(400)</w:t>
+            </w:r>
+          </w:p>
+        </w:tc>
+        <w:tc>
+          <w:tcPr>
+            <w:tcW w:type="dxa" w:w="2880"/>
+          </w:tcPr>
+          <w:p>
+            <w:r>
+              <w:t>curl</w:t>
+            </w:r>
+          </w:p>
+        </w:tc>
+        <w:tc>
+          <w:tcPr>
+            <w:tcW w:type="dxa" w:w="2880"/>
+          </w:tcPr>
+          <w:p>
+            <w:r>
+              <w:t>PASS</w:t>
+            </w:r>
+          </w:p>
+        </w:tc>
+      </w:tr>
+      <w:tr>
+        <w:tc>
+          <w:tcPr>
+            <w:tcW w:type="dxa" w:w="2880"/>
+          </w:tcPr>
+          <w:p>
+            <w:r>
+              <w:t>로그인 성공/실패(401 INVALID_CREDENTIALS)</w:t>
+            </w:r>
+          </w:p>
+        </w:tc>
+        <w:tc>
+          <w:tcPr>
+            <w:tcW w:type="dxa" w:w="2880"/>
+          </w:tcPr>
+          <w:p>
+            <w:r>
+              <w:t>curl</w:t>
+            </w:r>
+          </w:p>
+        </w:tc>
+        <w:tc>
+          <w:tcPr>
+            <w:tcW w:type="dxa" w:w="2880"/>
+          </w:tcPr>
+          <w:p>
+            <w:r>
+              <w:t>PASS</w:t>
+            </w:r>
+          </w:p>
+        </w:tc>
+      </w:tr>
+      <w:tr>
+        <w:tc>
+          <w:tcPr>
+            <w:tcW w:type="dxa" w:w="2880"/>
+          </w:tcPr>
+          <w:p>
+            <w:r>
+              <w:t>팀 생성 → 초대코드 합류(성공/404) → 멤버 목록 조회</w:t>
+            </w:r>
+          </w:p>
+        </w:tc>
+        <w:tc>
+          <w:tcPr>
+            <w:tcW w:type="dxa" w:w="2880"/>
+          </w:tcPr>
+          <w:p>
+            <w:r>
+              <w:t>curl</w:t>
+            </w:r>
+          </w:p>
+        </w:tc>
+        <w:tc>
+          <w:tcPr>
+            <w:tcW w:type="dxa" w:w="2880"/>
+          </w:tcPr>
+          <w:p>
+            <w:r>
+              <w:t>PASS</w:t>
+            </w:r>
+          </w:p>
+        </w:tc>
+      </w:tr>
+      <w:tr>
+        <w:tc>
+          <w:tcPr>
+            <w:tcW w:type="dxa" w:w="2880"/>
+          </w:tcPr>
+          <w:p>
+            <w:r>
+              <w:t>태스크 생성(assignee) → 필터(@me/미할당) → 상태변경(PATCH) → 삭제 권한(403→200)</w:t>
+            </w:r>
+          </w:p>
+        </w:tc>
+        <w:tc>
+          <w:tcPr>
+            <w:tcW w:type="dxa" w:w="2880"/>
+          </w:tcPr>
+          <w:p>
+            <w:r>
+              <w:t>curl</w:t>
+            </w:r>
+          </w:p>
+        </w:tc>
+        <w:tc>
+          <w:tcPr>
+            <w:tcW w:type="dxa" w:w="2880"/>
+          </w:tcPr>
+          <w:p>
+            <w:r>
+              <w:t>PASS</w:t>
+            </w:r>
+          </w:p>
+        </w:tc>
+      </w:tr>
+      <w:tr>
+        <w:tc>
+          <w:tcPr>
+            <w:tcW w:type="dxa" w:w="2880"/>
+          </w:tcPr>
+          <w:p>
+            <w:r>
+              <w:t>채팅 전송 → 1000자 초과(400 TOO_LONG) → 삭제 권한(403 NOT_OWNER→200)</w:t>
+            </w:r>
+          </w:p>
+        </w:tc>
+        <w:tc>
+          <w:tcPr>
+            <w:tcW w:type="dxa" w:w="2880"/>
+          </w:tcPr>
+          <w:p>
+            <w:r>
+              <w:t>curl</w:t>
+            </w:r>
+          </w:p>
+        </w:tc>
+        <w:tc>
+          <w:tcPr>
+            <w:tcW w:type="dxa" w:w="2880"/>
+          </w:tcPr>
+          <w:p>
+            <w:r>
+              <w:t>PASS</w:t>
+            </w:r>
+          </w:p>
+        </w:tc>
+      </w:tr>
+      <w:tr>
+        <w:tc>
+          <w:tcPr>
+            <w:tcW w:type="dxa" w:w="2880"/>
+          </w:tcPr>
+          <w:p>
+            <w:r>
+              <w:t>owner 탈퇴 차단(403) / 비멤버 팀 접근 차단(403)</w:t>
+            </w:r>
+          </w:p>
+        </w:tc>
+        <w:tc>
+          <w:tcPr>
+            <w:tcW w:type="dxa" w:w="2880"/>
+          </w:tcPr>
+          <w:p>
+            <w:r>
+              <w:t>curl</w:t>
+            </w:r>
+          </w:p>
+        </w:tc>
+        <w:tc>
+          <w:tcPr>
+            <w:tcW w:type="dxa" w:w="2880"/>
+          </w:tcPr>
+          <w:p>
+            <w:r>
+              <w:t>PASS</w:t>
+            </w:r>
+          </w:p>
+        </w:tc>
+      </w:tr>
+      <w:tr>
+        <w:tc>
+          <w:tcPr>
+            <w:tcW w:type="dxa" w:w="2880"/>
+          </w:tcPr>
+          <w:p>
+            <w:r>
+              <w:t>root(/) → /login.html 리다이렉트, 회원가입 → 팀 생성 → 칸반 → 채팅 → 멤버 화면 전체 플로우</w:t>
+            </w:r>
+          </w:p>
+        </w:tc>
+        <w:tc>
+          <w:tcPr>
+            <w:tcW w:type="dxa" w:w="2880"/>
+          </w:tcPr>
+          <w:p>
+            <w:r>
+              <w:t>브라우저(Playwright)</w:t>
+            </w:r>
+          </w:p>
+        </w:tc>
+        <w:tc>
+          <w:tcPr>
+            <w:tcW w:type="dxa" w:w="2880"/>
+          </w:tcPr>
+          <w:p>
+            <w:r>
+              <w:t>PASS</w:t>
+            </w:r>
+          </w:p>
+        </w:tc>
+      </w:tr>
+      <w:tr>
+        <w:tc>
+          <w:tcPr>
+            <w:tcW w:type="dxa" w:w="2880"/>
+          </w:tcPr>
+          <w:p>
+            <w:r>
+              <w:t>브라우저 콘솔 에러 0건 (favicon 404 제외)</w:t>
+            </w:r>
+          </w:p>
+        </w:tc>
+        <w:tc>
+          <w:tcPr>
+            <w:tcW w:type="dxa" w:w="2880"/>
+          </w:tcPr>
+          <w:p>
+            <w:r>
+              <w:t>브라우저</w:t>
+            </w:r>
+          </w:p>
+        </w:tc>
+        <w:tc>
+          <w:tcPr>
+            <w:tcW w:type="dxa" w:w="2880"/>
+          </w:tcPr>
+          <w:p>
+            <w:r>
+              <w:t>PASS</w:t>
+            </w:r>
+          </w:p>
+        </w:tc>
+      </w:tr>
+    </w:tbl>
+    <w:p/>
+    <w:p>
+      <w:r>
+        <w:drawing>
+          <wp:inline xmlns:a="http://schemas.openxmlformats.org/drawingml/2006/main" xmlns:pic="http://schemas.openxmlformats.org/drawingml/2006/picture">
+            <wp:extent cx="5029200" cy="3143250"/>
+            <wp:docPr id="14" name="Picture 14"/>
+            <wp:cNvGraphicFramePr>
+              <a:graphicFrameLocks noChangeAspect="1"/>
+            </wp:cNvGraphicFramePr>
+            <a:graphic>
+              <a:graphicData uri="http://schemas.openxmlformats.org/drawingml/2006/picture">
+                <pic:pic>
+                  <pic:nvPicPr>
+                    <pic:cNvPr id="0" name="14-local-recheck-members.png"/>
+                    <pic:cNvPicPr/>
+                  </pic:nvPicPr>
+                  <pic:blipFill>
+                    <a:blip r:embed="rId22"/>
+                    <a:stretch>
+                      <a:fillRect/>
+                    </a:stretch>
+                  </pic:blipFill>
+                  <pic:spPr>
+                    <a:xfrm>
+                      <a:off x="0" y="0"/>
+                      <a:ext cx="5029200" cy="3143250"/>
+                    </a:xfrm>
+                    <a:prstGeom prst="rect"/>
+                  </pic:spPr>
+                </pic:pic>
+              </a:graphicData>
+            </a:graphic>
+          </wp:inline>
+        </w:drawing>
+      </w:r>
+    </w:p>
+    <w:p>
+      <w:pPr>
+        <w:jc w:val="center"/>
+      </w:pPr>
+      <w:r>
+        <w:rPr>
+          <w:i/>
+          <w:sz w:val="18"/>
+        </w:rPr>
+        <w:t>로컬 재검증: 멤버 화면 (owner 팀 탈퇴 버튼 비활성화)</w:t>
+      </w:r>
+    </w:p>
+    <w:p/>
+    <w:p>
+      <w:pPr>
+        <w:pStyle w:val="Heading1"/>
+      </w:pPr>
+      <w:r>
         <w:t>종합</w:t>
       </w:r>
     </w:p>

</xml_diff>